<commit_message>
Populate all V6 docs with real contact and banking details
- Richard Shewry / VillageIO / richard@villageio.co.za / 071 385 3031
- Banking: FNB / Villageio (Pty) Ltd / 63102585370 / 250655
- SASA contact set to Programme Coordinator (no named contact yet)
- Removed italic styling from real data in quote and invoice HTML
- All DOCXs and PDFs regenerated with final details

Co-Authored-By: Claude Sonnet 4.6 <noreply@anthropic.com>
</commit_message>
<xml_diff>
--- a/docs/proposals/2026-03-23-sasa-ai-invoice-v6.docx
+++ b/docs/proposals/2026-03-23-sasa-ai-invoice-v6.docx
@@ -123,7 +123,7 @@
         <w:t xml:space="preserve"> </w:t>
       </w:r>
       <w:r>
-        <w:t xml:space="preserve">[Email] | [Phone]</w:t>
+        <w:t xml:space="preserve">richard@villageio.co.za | 071 385 3031</w:t>
       </w:r>
     </w:p>
     <w:p>
@@ -178,7 +178,7 @@
         <w:t xml:space="preserve"> </w:t>
       </w:r>
       <w:r>
-        <w:t xml:space="preserve">[Contact Name]</w:t>
+        <w:t xml:space="preserve">Richard Shewry</w:t>
       </w:r>
       <w:r>
         <w:t xml:space="preserve"> </w:t>
@@ -813,7 +813,7 @@
               <w:pStyle w:val="Compact"/>
             </w:pPr>
             <w:r>
-              <w:t xml:space="preserve">[Bank Name]</w:t>
+              <w:t xml:space="preserve">FNB</w:t>
             </w:r>
           </w:p>
         </w:tc>
@@ -837,7 +837,7 @@
               <w:pStyle w:val="Compact"/>
             </w:pPr>
             <w:r>
-              <w:t xml:space="preserve">[Account Name]</w:t>
+              <w:t xml:space="preserve">Villageio (Pty) Ltd</w:t>
             </w:r>
           </w:p>
         </w:tc>
@@ -861,7 +861,7 @@
               <w:pStyle w:val="Compact"/>
             </w:pPr>
             <w:r>
-              <w:t xml:space="preserve">[Account Number]</w:t>
+              <w:t xml:space="preserve">63102585370</w:t>
             </w:r>
           </w:p>
         </w:tc>
@@ -885,7 +885,7 @@
               <w:pStyle w:val="Compact"/>
             </w:pPr>
             <w:r>
-              <w:t xml:space="preserve">[Branch Code]</w:t>
+              <w:t xml:space="preserve">250655</w:t>
             </w:r>
           </w:p>
         </w:tc>
@@ -1032,7 +1032,7 @@
           <w:b/>
           <w:bCs/>
         </w:rPr>
-        <w:t xml:space="preserve">[Email] | [Phone]</w:t>
+        <w:t xml:space="preserve">richard@villageio.co.za | 071 385 3031</w:t>
       </w:r>
     </w:p>
     <w:bookmarkEnd w:id="14"/>

</xml_diff>

<commit_message>
Regenerate invoice to match accepted quote (zero VAT, R21,000)
Aligned invoice INV-SASA-2026-002 to match QUOTE-SASA-2026-002:
- Zero VAT (VillageIO not VAT registered) — total R21,000
- Reference updated to SASA-2026-002
- Address: 119 Madeline Road, Windermere, Durban
- Removed registration/VAT number placeholders from letterhead
- Payment terms: "No VAT" explicitly stated
- Banking ref: SASA-2026-002

Co-Authored-By: Claude Sonnet 4.6 <noreply@anthropic.com>
</commit_message>
<xml_diff>
--- a/docs/proposals/2026-03-23-sasa-ai-invoice-v6.docx
+++ b/docs/proposals/2026-03-23-sasa-ai-invoice-v6.docx
@@ -42,7 +42,7 @@
         <w:t xml:space="preserve"> </w:t>
       </w:r>
       <w:r>
-        <w:t xml:space="preserve">INV-SASA-2026-001</w:t>
+        <w:t xml:space="preserve">INV-SASA-2026-002</w:t>
       </w:r>
       <w:r>
         <w:t xml:space="preserve"> </w:t>
@@ -111,13 +111,19 @@
         <w:t xml:space="preserve"> </w:t>
       </w:r>
       <w:r>
-        <w:t xml:space="preserve">[Registration Number]</w:t>
+        <w:t xml:space="preserve">119 Madeline Road</w:t>
       </w:r>
       <w:r>
         <w:t xml:space="preserve"> </w:t>
       </w:r>
       <w:r>
-        <w:t xml:space="preserve">[VAT Number]</w:t>
+        <w:t xml:space="preserve">Windermere</w:t>
+      </w:r>
+      <w:r>
+        <w:t xml:space="preserve"> </w:t>
+      </w:r>
+      <w:r>
+        <w:t xml:space="preserve">Durban</w:t>
       </w:r>
       <w:r>
         <w:t xml:space="preserve"> </w:t>
@@ -178,23 +184,7 @@
         <w:t xml:space="preserve"> </w:t>
       </w:r>
       <w:r>
-        <w:t xml:space="preserve">Richard Shewry</w:t>
-      </w:r>
-      <w:r>
-        <w:t xml:space="preserve"> </w:t>
-      </w:r>
-      <w:r>
-        <w:rPr>
-          <w:b/>
-          <w:bCs/>
-        </w:rPr>
-        <w:t xml:space="preserve">Budget Line:</w:t>
-      </w:r>
-      <w:r>
-        <w:t xml:space="preserve"> </w:t>
-      </w:r>
-      <w:r>
-        <w:t xml:space="preserve">Professional Fees</w:t>
+        <w:t xml:space="preserve">Programme Coordinator</w:t>
       </w:r>
       <w:r>
         <w:t xml:space="preserve"> </w:t>
@@ -210,7 +200,7 @@
         <w:t xml:space="preserve"> </w:t>
       </w:r>
       <w:r>
-        <w:t xml:space="preserve">QUOTE-SASA-2026-001</w:t>
+        <w:t xml:space="preserve">QUOTE-SASA-2026-002</w:t>
       </w:r>
     </w:p>
     <w:p>
@@ -480,12 +470,14 @@
     <w:tbl>
       <w:tblPr>
         <w:tblStyle w:val="Table"/>
-        <w:tblW w:type="auto" w:w="0"/>
+        <w:tblW w:type="pct" w:w="5000"/>
+        <w:tblLayout w:type="fixed"/>
         <w:tblLook w:firstRow="1" w:lastRow="0" w:firstColumn="0" w:lastColumn="0" w:noHBand="0" w:noVBand="0" w:val="0020"/>
       </w:tblPr>
       <w:tblGrid>
-        <w:gridCol w:w="3960"/>
-        <w:gridCol w:w="3960"/>
+        <w:gridCol w:w="2640"/>
+        <w:gridCol w:w="2640"/>
+        <w:gridCol w:w="2640"/>
       </w:tblGrid>
       <w:tr>
         <w:trPr>
@@ -513,6 +505,17 @@
             </w:r>
           </w:p>
         </w:tc>
+        <w:tc>
+          <w:tcPr/>
+          <w:p>
+            <w:pPr>
+              <w:pStyle w:val="Compact"/>
+            </w:pPr>
+            <w:r>
+              <w:t xml:space="preserve">Timing</w:t>
+            </w:r>
+          </w:p>
+        </w:tc>
       </w:tr>
       <w:tr>
         <w:tc>
@@ -537,6 +540,17 @@
             </w:r>
           </w:p>
         </w:tc>
+        <w:tc>
+          <w:tcPr/>
+          <w:p>
+            <w:pPr>
+              <w:pStyle w:val="Compact"/>
+            </w:pPr>
+            <w:r>
+              <w:t xml:space="preserve">Week 1</w:t>
+            </w:r>
+          </w:p>
+        </w:tc>
       </w:tr>
       <w:tr>
         <w:tc>
@@ -561,6 +575,17 @@
             </w:r>
           </w:p>
         </w:tc>
+        <w:tc>
+          <w:tcPr/>
+          <w:p>
+            <w:pPr>
+              <w:pStyle w:val="Compact"/>
+            </w:pPr>
+            <w:r>
+              <w:t xml:space="preserve">Week 3</w:t>
+            </w:r>
+          </w:p>
+        </w:tc>
       </w:tr>
       <w:tr>
         <w:tc>
@@ -585,6 +610,17 @@
             </w:r>
           </w:p>
         </w:tc>
+        <w:tc>
+          <w:tcPr/>
+          <w:p>
+            <w:pPr>
+              <w:pStyle w:val="Compact"/>
+            </w:pPr>
+            <w:r>
+              <w:t xml:space="preserve">Week 5</w:t>
+            </w:r>
+          </w:p>
+        </w:tc>
       </w:tr>
       <w:tr>
         <w:tc>
@@ -609,6 +645,17 @@
             </w:r>
           </w:p>
         </w:tc>
+        <w:tc>
+          <w:tcPr/>
+          <w:p>
+            <w:pPr>
+              <w:pStyle w:val="Compact"/>
+            </w:pPr>
+            <w:r>
+              <w:t xml:space="preserve">Week 7</w:t>
+            </w:r>
+          </w:p>
+        </w:tc>
       </w:tr>
       <w:tr>
         <w:tc>
@@ -633,6 +680,17 @@
             </w:r>
           </w:p>
         </w:tc>
+        <w:tc>
+          <w:tcPr/>
+          <w:p>
+            <w:pPr>
+              <w:pStyle w:val="Compact"/>
+            </w:pPr>
+            <w:r>
+              <w:t xml:space="preserve">Week 9</w:t>
+            </w:r>
+          </w:p>
+        </w:tc>
       </w:tr>
       <w:tr>
         <w:tc>
@@ -654,6 +712,17 @@
             </w:pPr>
             <w:r>
               <w:t xml:space="preserve">Build Day, Governance &amp; Programme Roadmap</w:t>
+            </w:r>
+          </w:p>
+        </w:tc>
+        <w:tc>
+          <w:tcPr/>
+          <w:p>
+            <w:pPr>
+              <w:pStyle w:val="Compact"/>
+            </w:pPr>
+            <w:r>
+              <w:t xml:space="preserve">Week 11</w:t>
             </w:r>
           </w:p>
         </w:tc>
@@ -694,7 +763,7 @@
               <w:pStyle w:val="Compact"/>
             </w:pPr>
             <w:r>
-              <w:t xml:space="preserve">Subtotal (excl. VAT)</w:t>
+              <w:t xml:space="preserve">Subtotal</w:t>
             </w:r>
           </w:p>
         </w:tc>
@@ -718,18 +787,18 @@
               <w:pStyle w:val="Compact"/>
             </w:pPr>
             <w:r>
-              <w:t xml:space="preserve">VAT @ 15%</w:t>
-            </w:r>
-          </w:p>
-        </w:tc>
-        <w:tc>
-          <w:tcPr/>
-          <w:p>
-            <w:pPr>
-              <w:pStyle w:val="Compact"/>
-            </w:pPr>
-            <w:r>
-              <w:t xml:space="preserve">R3,150.00</w:t>
+              <w:t xml:space="preserve">VAT</w:t>
+            </w:r>
+          </w:p>
+        </w:tc>
+        <w:tc>
+          <w:tcPr/>
+          <w:p>
+            <w:pPr>
+              <w:pStyle w:val="Compact"/>
+            </w:pPr>
+            <w:r>
+              <w:t xml:space="preserve">R0.00</w:t>
             </w:r>
           </w:p>
         </w:tc>
@@ -761,7 +830,7 @@
                 <w:b/>
                 <w:bCs/>
               </w:rPr>
-              <w:t xml:space="preserve">R24,150.00</w:t>
+              <w:t xml:space="preserve">R21,000.00</w:t>
             </w:r>
           </w:p>
         </w:tc>
@@ -909,7 +978,7 @@
               <w:pStyle w:val="Compact"/>
             </w:pPr>
             <w:r>
-              <w:t xml:space="preserve">SASA-2026-001</w:t>
+              <w:t xml:space="preserve">SASA-2026-002</w:t>
             </w:r>
           </w:p>
         </w:tc>
@@ -941,6 +1010,18 @@
         </w:numPr>
       </w:pPr>
       <w:r>
+        <w:t xml:space="preserve">Sessions invoiced individually upon completion of each session</w:t>
+      </w:r>
+    </w:p>
+    <w:p>
+      <w:pPr>
+        <w:pStyle w:val="Compact"/>
+        <w:numPr>
+          <w:ilvl w:val="0"/>
+          <w:numId w:val="1001"/>
+        </w:numPr>
+      </w:pPr>
+      <w:r>
         <w:t xml:space="preserve">Payment due within</w:t>
       </w:r>
       <w:r>
@@ -957,7 +1038,7 @@
         <w:t xml:space="preserve"> </w:t>
       </w:r>
       <w:r>
-        <w:t xml:space="preserve">of invoice date</w:t>
+        <w:t xml:space="preserve">of session</w:t>
       </w:r>
     </w:p>
     <w:p>
@@ -981,7 +1062,7 @@
         </w:numPr>
       </w:pPr>
       <w:r>
-        <w:t xml:space="preserve">VAT charged at the prevailing rate (currently 15%)</w:t>
+        <w:t xml:space="preserve">No VAT</w:t>
       </w:r>
     </w:p>
     <w:p>

</xml_diff>